<commit_message>
feat: add 1 new team member information in project proposal documents
</commit_message>
<xml_diff>
--- a/docs/Group - 1 - Project Proposal AWT.docx
+++ b/docs/Group - 1 - Project Proposal AWT.docx
@@ -147,15 +147,7 @@
                 <w:sz w:val="22"/>
                 <w:szCs w:val="28"/>
               </w:rPr>
-              <w:t>00931</w:t>
-            </w:r>
-            <w:r>
-              <w:rPr>
-                <w:rFonts w:cs="Times New Roman"/>
-                <w:sz w:val="22"/>
-                <w:szCs w:val="28"/>
-              </w:rPr>
-              <w:t xml:space="preserve"> </w:t>
+              <w:t xml:space="preserve">00931 </w:t>
             </w:r>
             <w:r>
               <w:rPr>
@@ -301,13 +293,7 @@
         <w:rPr>
           <w:rFonts w:cs="Times New Roman"/>
         </w:rPr>
-        <w:t>:</w:t>
-      </w:r>
-      <w:r>
-        <w:rPr>
-          <w:rFonts w:cs="Times New Roman"/>
-        </w:rPr>
-        <w:t xml:space="preserve"> AIUB, BSc in CSE</w:t>
+        <w:t>: AIUB, BSc in CSE</w:t>
       </w:r>
       <w:r>
         <w:rPr>
@@ -385,7 +371,7 @@
           <w:sz w:val="22"/>
           <w:szCs w:val="24"/>
         </w:rPr>
-        <w:t>Author</w:t>
+        <w:t>Team members</w:t>
       </w:r>
       <w:r>
         <w:rPr>
@@ -394,6 +380,14 @@
           <w:szCs w:val="24"/>
         </w:rPr>
         <w:t>:</w:t>
+      </w:r>
+      <w:r>
+        <w:rPr>
+          <w:rFonts w:ascii="Aptos SemiBold" w:hAnsi="Aptos SemiBold" w:cs="Times New Roman"/>
+          <w:sz w:val="22"/>
+          <w:szCs w:val="24"/>
+        </w:rPr>
+        <w:t xml:space="preserve"> (The Beekeeper)</w:t>
       </w:r>
     </w:p>
     <w:tbl>
@@ -429,14 +423,6 @@
               </w:rPr>
               <w:t>Name</w:t>
             </w:r>
-            <w:r>
-              <w:rPr>
-                <w:rFonts w:cs="Times New Roman"/>
-                <w:sz w:val="22"/>
-                <w:szCs w:val="24"/>
-              </w:rPr>
-              <w:t>: Sagar Biswas</w:t>
-            </w:r>
           </w:p>
         </w:tc>
         <w:tc>
@@ -459,15 +445,107 @@
                 <w:sz w:val="22"/>
                 <w:szCs w:val="24"/>
               </w:rPr>
-              <w:t>Student ID:</w:t>
-            </w:r>
-            <w:r>
-              <w:rPr>
-                <w:rFonts w:cs="Times New Roman"/>
+              <w:t>Student ID</w:t>
+            </w:r>
+          </w:p>
+        </w:tc>
+      </w:tr>
+      <w:tr>
+        <w:tc>
+          <w:tcPr>
+            <w:tcW w:w="5228" w:type="dxa"/>
+          </w:tcPr>
+          <w:p>
+            <w:pPr>
+              <w:spacing w:line="276" w:lineRule="auto"/>
+              <w:jc w:val="center"/>
+              <w:rPr>
+                <w:rFonts w:ascii="Aptos SemiBold" w:hAnsi="Aptos SemiBold" w:cs="Times New Roman"/>
                 <w:sz w:val="22"/>
                 <w:szCs w:val="24"/>
               </w:rPr>
-              <w:t xml:space="preserve"> 22-47929-2</w:t>
+            </w:pPr>
+            <w:r>
+              <w:rPr>
+                <w:rFonts w:cs="Times New Roman"/>
+                <w:sz w:val="22"/>
+                <w:szCs w:val="24"/>
+              </w:rPr>
+              <w:t>Sagar Biswas</w:t>
+            </w:r>
+          </w:p>
+        </w:tc>
+        <w:tc>
+          <w:tcPr>
+            <w:tcW w:w="5228" w:type="dxa"/>
+          </w:tcPr>
+          <w:p>
+            <w:pPr>
+              <w:spacing w:line="276" w:lineRule="auto"/>
+              <w:jc w:val="center"/>
+              <w:rPr>
+                <w:rFonts w:ascii="Aptos SemiBold" w:hAnsi="Aptos SemiBold" w:cs="Times New Roman"/>
+                <w:sz w:val="22"/>
+                <w:szCs w:val="24"/>
+              </w:rPr>
+            </w:pPr>
+            <w:r>
+              <w:rPr>
+                <w:rFonts w:cs="Times New Roman"/>
+                <w:sz w:val="22"/>
+                <w:szCs w:val="24"/>
+              </w:rPr>
+              <w:t>22-47929-2</w:t>
+            </w:r>
+          </w:p>
+        </w:tc>
+      </w:tr>
+      <w:tr>
+        <w:tc>
+          <w:tcPr>
+            <w:tcW w:w="5228" w:type="dxa"/>
+          </w:tcPr>
+          <w:p>
+            <w:pPr>
+              <w:spacing w:line="276" w:lineRule="auto"/>
+              <w:jc w:val="center"/>
+              <w:rPr>
+                <w:rFonts w:ascii="Aptos SemiBold" w:hAnsi="Aptos SemiBold" w:cs="Times New Roman"/>
+                <w:sz w:val="22"/>
+                <w:szCs w:val="24"/>
+              </w:rPr>
+            </w:pPr>
+            <w:r>
+              <w:rPr>
+                <w:rFonts w:cs="Times New Roman"/>
+                <w:sz w:val="22"/>
+                <w:szCs w:val="24"/>
+              </w:rPr>
+              <w:t>Md. Minhazul Hassan</w:t>
+            </w:r>
+          </w:p>
+        </w:tc>
+        <w:tc>
+          <w:tcPr>
+            <w:tcW w:w="5228" w:type="dxa"/>
+          </w:tcPr>
+          <w:p>
+            <w:pPr>
+              <w:spacing w:line="276" w:lineRule="auto"/>
+              <w:jc w:val="center"/>
+              <w:rPr>
+                <w:rFonts w:cs="Times New Roman"/>
+                <w:sz w:val="22"/>
+                <w:szCs w:val="24"/>
+              </w:rPr>
+            </w:pPr>
+            <w:r>
+              <w:rPr>
+                <w:rFonts w:cs="Times New Roman"/>
+                <w:sz w:val="22"/>
+                <w:szCs w:val="24"/>
+              </w:rPr>
+              <w:t>23-53049-3</w:t>
             </w:r>
           </w:p>
         </w:tc>
@@ -529,13 +607,23 @@
         </w:rPr>
         <w:t xml:space="preserve"> </w:t>
       </w:r>
+      <w:proofErr w:type="spellStart"/>
       <w:r>
         <w:rPr>
           <w:rFonts w:cs="Times New Roman"/>
           <w:sz w:val="22"/>
           <w:szCs w:val="22"/>
         </w:rPr>
-        <w:t>Sultanul Arifeen Hamim</w:t>
+        <w:t>Sultanul</w:t>
+      </w:r>
+      <w:proofErr w:type="spellEnd"/>
+      <w:r>
+        <w:rPr>
+          <w:rFonts w:cs="Times New Roman"/>
+          <w:sz w:val="22"/>
+          <w:szCs w:val="22"/>
+        </w:rPr>
+        <w:t xml:space="preserve"> Arifeen Hamim</w:t>
       </w:r>
     </w:p>
     <w:p>
@@ -1693,6 +1781,7 @@
                 <w:sz w:val="18"/>
                 <w:szCs w:val="18"/>
               </w:rPr>
+              <w:lastRenderedPageBreak/>
               <w:t>Auth</w:t>
             </w:r>
           </w:p>
@@ -1811,7 +1900,6 @@
                 <w:sz w:val="18"/>
                 <w:szCs w:val="18"/>
               </w:rPr>
-              <w:lastRenderedPageBreak/>
               <w:t>Email</w:t>
             </w:r>
           </w:p>
@@ -4194,6 +4282,7 @@
                 <w:sz w:val="18"/>
                 <w:szCs w:val="18"/>
               </w:rPr>
+              <w:lastRenderedPageBreak/>
               <w:t>Infrastructure</w:t>
             </w:r>
           </w:p>
@@ -4326,16 +4415,7 @@
                 <w:sz w:val="18"/>
                 <w:szCs w:val="18"/>
               </w:rPr>
-              <w:t xml:space="preserve"> no edge functions or serverless). The frontend static assets are served from Vercel's CDN, providing low-latency delivery </w:t>
-            </w:r>
-            <w:r>
-              <w:rPr>
-                <w:rFonts w:cs="Times New Roman"/>
-                <w:sz w:val="18"/>
-                <w:szCs w:val="18"/>
-              </w:rPr>
-              <w:lastRenderedPageBreak/>
-              <w:t>globally for pre-rendered pages without edge computing for the API layer</w:t>
+              <w:t xml:space="preserve"> no edge functions or serverless). The frontend static assets are served from Vercel's CDN, providing low-latency delivery globally for pre-rendered pages without edge computing for the API layer</w:t>
             </w:r>
           </w:p>
         </w:tc>
@@ -5008,7 +5088,6 @@
           <w:sz w:val="22"/>
           <w:szCs w:val="28"/>
         </w:rPr>
-        <w:lastRenderedPageBreak/>
         <w:t xml:space="preserve">Live: </w:t>
       </w:r>
       <w:hyperlink r:id="rId8" w:history="1">
@@ -6165,6 +6244,7 @@
           <w:sz w:val="22"/>
           <w:szCs w:val="28"/>
         </w:rPr>
+        <w:lastRenderedPageBreak/>
         <w:t>P</w:t>
       </w:r>
       <w:r>
@@ -6226,7 +6306,6 @@
           <w:szCs w:val="28"/>
           <w:u w:val="single"/>
         </w:rPr>
-        <w:lastRenderedPageBreak/>
         <w:t>User Types &amp; Features</w:t>
       </w:r>
       <w:r>
@@ -8412,6 +8491,7 @@
           <w:sz w:val="22"/>
           <w:szCs w:val="28"/>
         </w:rPr>
+        <w:lastRenderedPageBreak/>
         <w:t>P</w:t>
       </w:r>
       <w:r>
@@ -8467,7 +8547,6 @@
           <w:sz w:val="22"/>
           <w:szCs w:val="28"/>
         </w:rPr>
-        <w:lastRenderedPageBreak/>
         <w:t>Features by User Type</w:t>
       </w:r>
     </w:p>
@@ -10735,6 +10814,7 @@
           <w:sz w:val="22"/>
           <w:szCs w:val="28"/>
         </w:rPr>
+        <w:lastRenderedPageBreak/>
         <w:t>P</w:t>
       </w:r>
       <w:r>
@@ -10792,7 +10872,6 @@
           <w:sz w:val="22"/>
           <w:szCs w:val="28"/>
         </w:rPr>
-        <w:lastRenderedPageBreak/>
         <w:drawing>
           <wp:anchor distT="0" distB="0" distL="114300" distR="114300" simplePos="0" relativeHeight="251658242" behindDoc="1" locked="0" layoutInCell="1" allowOverlap="1" wp14:anchorId="66E6F114" wp14:editId="54A09228">
             <wp:simplePos x="0" y="0"/>
@@ -10914,6 +10993,7 @@
           <w:rFonts w:cs="Times New Roman"/>
           <w:b/>
           <w:bCs/>
+          <w:noProof/>
           <w:sz w:val="22"/>
           <w:szCs w:val="28"/>
         </w:rPr>
@@ -11456,7 +11536,6 @@
           <w:sz w:val="22"/>
           <w:szCs w:val="28"/>
         </w:rPr>
-        <w:lastRenderedPageBreak/>
         <w:t>Admin (Role.ADMIN)</w:t>
       </w:r>
     </w:p>
@@ -13636,6 +13715,7 @@
           <w:sz w:val="22"/>
           <w:szCs w:val="28"/>
         </w:rPr>
+        <w:lastRenderedPageBreak/>
         <w:t>P.T.O</w:t>
       </w:r>
     </w:p>
@@ -13662,7 +13742,6 @@
           <w:sz w:val="22"/>
           <w:szCs w:val="28"/>
         </w:rPr>
-        <w:lastRenderedPageBreak/>
         <w:drawing>
           <wp:anchor distT="0" distB="0" distL="114300" distR="114300" simplePos="0" relativeHeight="251658247" behindDoc="1" locked="0" layoutInCell="1" allowOverlap="1" wp14:anchorId="6AA2247C" wp14:editId="0199FDF8">
             <wp:simplePos x="0" y="0"/>
@@ -29621,27 +29700,7 @@
             <w:sz w:val="22"/>
             <w:szCs w:val="28"/>
           </w:rPr>
-          <w:t>05-deployment-t</w:t>
-        </w:r>
-        <w:r>
-          <w:rPr>
-            <w:rStyle w:val="Hyperlink"/>
-            <w:rFonts w:ascii="Aptos SemiBold" w:hAnsi="Aptos SemiBold" w:cs="Times New Roman"/>
-            <w:noProof/>
-            <w:sz w:val="22"/>
-            <w:szCs w:val="28"/>
-          </w:rPr>
-          <w:t>o</w:t>
-        </w:r>
-        <w:r>
-          <w:rPr>
-            <w:rStyle w:val="Hyperlink"/>
-            <w:rFonts w:ascii="Aptos SemiBold" w:hAnsi="Aptos SemiBold" w:cs="Times New Roman"/>
-            <w:noProof/>
-            <w:sz w:val="22"/>
-            <w:szCs w:val="28"/>
-          </w:rPr>
-          <w:t>pology.png</w:t>
+          <w:t>05-deployment-topology.png</w:t>
         </w:r>
       </w:hyperlink>
     </w:p>
@@ -31558,25 +31617,7 @@
             <w:sz w:val="22"/>
             <w:szCs w:val="28"/>
           </w:rPr>
-          <w:t>ultih</w:t>
-        </w:r>
-        <w:r>
-          <w:rPr>
-            <w:rStyle w:val="Hyperlink"/>
-            <w:rFonts w:ascii="Aptos SemiBold" w:hAnsi="Aptos SemiBold" w:cs="Times New Roman"/>
-            <w:sz w:val="22"/>
-            <w:szCs w:val="28"/>
-          </w:rPr>
-          <w:t>a</w:t>
-        </w:r>
-        <w:r>
-          <w:rPr>
-            <w:rStyle w:val="Hyperlink"/>
-            <w:rFonts w:ascii="Aptos SemiBold" w:hAnsi="Aptos SemiBold" w:cs="Times New Roman"/>
-            <w:sz w:val="22"/>
-            <w:szCs w:val="28"/>
-          </w:rPr>
-          <w:t>t-</w:t>
+          <w:t>ultihat-</w:t>
         </w:r>
         <w:r>
           <w:rPr>
@@ -33135,6 +33176,7 @@
   <w:style w:type="character" w:default="1" w:styleId="DefaultParagraphFont">
     <w:name w:val="Default Paragraph Font"/>
     <w:uiPriority w:val="1"/>
+    <w:semiHidden/>
     <w:unhideWhenUsed/>
   </w:style>
   <w:style w:type="table" w:default="1" w:styleId="TableNormal">

</xml_diff>